<commit_message>
Complete Phase 6.5 final polish package
</commit_message>
<xml_diff>
--- a/ACP-Gini_MLResearch/Report/ACP-Gini_Report_Springer.docx
+++ b/ACP-Gini_MLResearch/Report/ACP-Gini_Report_Springer.docx
@@ -72,6 +72,11 @@
     <w:p>
       <w:r>
         <w:t>ACP-Gini addresses this local redundancy problem. At a node T, it discounts the Gini gain of candidate Xⱼ according to its absolute correlation with distinct features used by ancestors of T. The design retains the familiar CART induction procedure [1, 11], remains exactly backward-compatible at α=0, and leaves raw gain responsible for deciding whether an informative split exists.</w:t>
+      </w:r>
+    </w:p>
+    <w:p>
+      <w:r>
+        <w:t>We evaluate four research questions. RQ1: Does ACP-Gini improve bootstrap stability of feature choice and importance relative to CART? RQ2: Does it reduce selected-set redundancy and concentrate importance on one representative per correlated group? RQ3: What accuracy tradeoff does α induce, and is the selected setting statistically distinguishable from CART? RQ4: How does it affect tree complexity, and how should interpretive compactness be characterized?</w:t>
       </w:r>
     </w:p>
     <w:p>
@@ -165,7 +170,7 @@
     </w:p>
     <w:p>
       <w:r>
-        <w:t>The gap is therefore specific: prior work does not inject an interpretable pairwise correlation with root-to-node ancestors into the split criterion of a single tree. ACP-Gini is not an ensemble replacement; it is a local criterion for reducing repetitive feature use while preserving the mechanics and inspectability of CART.</w:t>
+        <w:t>To our knowledge, the gap is therefore specific: prior work does not inject an interpretable pairwise correlation with root-to-node ancestors into the split criterion of a single tree. ACP-Gini is not an ensemble replacement; it is a local criterion for reducing repetitive feature use while preserving the mechanics and inspectability of CART.</w:t>
       </w:r>
     </w:p>
     <w:p>
@@ -224,7 +229,7 @@
     </w:p>
     <w:p>
       <w:r>
-        <w:t>Inner stratified folds evaluate α ∈ 0.2,0.4,0.6,0.8,1.0. Eligible values have macro-F1 within one standard deviation of the α=0 mean, and importance rank correlation selects among eligible values. The final data-set value is the lower quartile of fold-level selections, rounded down to the grid. This conservative aggregation biases disagreements toward a weaker, more CART-like penalty, analogous in spirit to a one-standard-error rule. The RRF-style lambda ∈ 0.5,0.7,0.9 uses the upper quartile because larger lambda is the weaker penalty.</w:t>
+        <w:t>Inner stratified folds evaluate α ∈ 0.2,0.4,0.6,0.8,1.0. Eligible values have macro-F1 within one standard deviation of the α=0 mean, and importance rank correlation selects among eligible values. The final data-set value is the lower quartile of fold-level selections, rounded down to the grid. We treat this data-set-level value as a conservative consensus operating point aggregated from per-fold inner-CV selections. It is not a fully nested unbiased selection protocol; however, the operating sweep in Fig. 4 shows that accuracy varies by at most approximately 0.3 percentage points on WDBC through α=.8 and 0.2 points across the entire Wine grid. The documented WDBC α=1 failure is outside the selected operating region. This flat practical region makes material inflation of the reported selected-setting accuracy unlikely. The RRF-style lambda ∈ 0.5,0.7,0.9 uses the upper quartile because larger lambda is the weaker penalty.</w:t>
       </w:r>
     </w:p>
     <w:p>
@@ -242,7 +247,12 @@
     </w:p>
     <w:p>
       <w:r>
-        <w:t>Synthetic data contain five independent Gaussian signals with weights (1,.8,.6,.4,.2), three correlated copies per signal, and five noise features. A copy is ρ Z+sqrt1-ρ^2epsilon for ρ ∈.7,.8,.9,.95,.99. Group coverage is the fraction of the five signal groups represented among the top-five importance features. Group concentration averages max_j ∈ gI_j/sum_j ∈ gI_j over all five groups; a zero-mass group contributes zero. Noise importance is the total mass on the five noise columns.</w:t>
+        <w:t>Experiments ran with Python 3.10.11 on 64-bit Microsoft Windows 11 Pro using an AMD Ryzen 7 PRO 5850U CPU. The complete experiment suite required approximately 35 wall-clock minutes on this machine.</w:t>
+      </w:r>
+    </w:p>
+    <w:p>
+      <w:r>
+        <w:t>Synthetic data contain five independent Gaussian signals with weights (1,.8,.6,.4,.2), three correlated copies per signal, and five noise features. A copy is ρ Z+sqrt(1-rho^2) epsilon for ρ ∈.7,.8,.9,.95,.99. Group coverage is the fraction of the five signal groups represented among the top-five importance features. Group concentration averages max_j ∈ gI_j/sum_j ∈ gI_j over all five groups; a zero-mass group contributes zero. Noise importance is the total mass on the five noise columns.</w:t>
       </w:r>
     </w:p>
     <w:p>
@@ -257,7 +267,7 @@
     </w:p>
     <w:p>
       <w:r>
-        <w:t>Both use the full-data correlation matrix for a consistent diagnostic scale and are reported for main fits and averaged bootstrap fits. Wilcoxon signed-rank tests use paired fold observations [15]. Root agreement is retained in raw CSVs but omitted from headline tables because ACP-Gini is identical to CART at the root by construction.</w:t>
+        <w:t>Both use the full-data correlation matrix for a consistent diagnostic scale and are reported for main fits and averaged bootstrap fits. The full-data correlation matrix serves exclusively as a label-free, post-hoc diagnostic scale and does not participate in model fitting or hyperparameter selection. Wilcoxon signed-rank tests use paired fold observations [15]. The four ACP-Gini-versus-CART bootstrap weighted-redundancy comparisons on the collinear data sets are the primary confirmatory family; all other Wilcoxon results are exploratory or descriptive. Repeated-CV folds share training data, so their p-values are approximate; we therefore emphasize effect sizes and cross-seed consistency. Root agreement is retained in raw CSVs but omitted from headline tables because ACP-Gini is identical to CART at the root by construction.</w:t>
       </w:r>
     </w:p>
     <w:p>
@@ -283,7 +293,7 @@
     </w:p>
     <w:p>
       <w:r>
-        <w:t>Figure~fig:synthetic reports group-level results. At ρ=.9, group coverage increases from.68 to.74 and group concentration from.690 to.745 between α=0 and 1. Across the five ρ values, endpoint coverage gains range from.04 to.10 and endpoint concentration gains from.027 to.098. Intermediate values are not strictly monotone for every ρ, but every endpoint improves. Figure~fig:sensitivity shows that accuracy remains near.79 at ρ=.9, while noise importance rises from.018 to approximately.033. This is a small but real side effect: discouraging redundant signal variables occasionally exposes weak noise splits.</w:t>
+        <w:t>Figure 1 reports group-level results. At ρ=.9, group coverage increases from.68 to.74 and group concentration from.690 to.745 between α=0 and 1. Across the five ρ values, endpoint coverage gains range from.04 to.10 and endpoint concentration gains from.027 to.098. Intermediate values are not strictly monotone for every ρ, but every endpoint improves. Figure 2 shows that accuracy remains near.79 at ρ=.9, while noise importance rises from.018 to approximately.033. This is a small but real side effect: discouraging redundant signal variables occasionally exposes weak noise splits.</w:t>
       </w:r>
     </w:p>
     <w:p>
@@ -311,7 +321,7 @@
     </w:p>
     <w:p>
       <w:r>
-        <w:t>The primary result is lower internal correlation. Bootstrap weighted redundancy falls from.621 to.545 on WDBC (12.1%),.183 to.128 on Wine (29.6%),.168 to.146 on Ionosphere (12.9%), and.218 to.195 on Sonar (10.8%). All four reductions are significant at p&lt;.001. Pima changes by only.0017 in absolute terms; despite a small p-value from repeated observations, this is no meaningful reduction and supports its role as a low-collinearity control. Figure~fig:redundancy visualizes the comparison.</w:t>
+        <w:t>The primary result is lower internal correlation. Bootstrap weighted redundancy falls from.621 to.545 on WDBC (12.1%),.183 to.128 on Wine (29.6%),.168 to.146 on Ionosphere (12.9%), and.218 to.195 on Sonar (10.8%). The four primary comparisons all have p≤.0003 and remain significant under Holm correction at α=.05. Pima changes by only.0017 in absolute terms; despite a small exploratory p-value from repeated observations, this is no meaningful reduction and supports its role as a low-collinearity control. Figure 3 visualizes the comparison.</w:t>
       </w:r>
     </w:p>
     <w:p>
@@ -321,7 +331,7 @@
     </w:p>
     <w:p>
       <w:r>
-        <w:t>The operating sweep in Fig.~fig:sweep separates a conservative default from attainable operating points. Across all three seeds, WDBC at α=.6 reduces main-fit weighted redundancy from.634 to.390 (38.5%) while accuracy changes from.934 to.932. The pre-specified seed-42 five-fold check reproduces.656 to.351 (46.5%) with accuracy unchanged at.926. Wine shows a smooth redundancy decline from.166 to.118 while accuracy stays between.746 and.748. Thus practitioners can increase α when redundancy reduction is worth a small tolerance in predictive performance.</w:t>
+        <w:t>The operating sweep in Fig. 4 separates a conservative default from attainable operating points. Across all three seeds, WDBC at α=.6 reduces main-fit weighted redundancy from.634 to.390 (38.5%) while accuracy changes from.934 to.932. The pre-specified seed-42 five-fold check reproduces.656 to.351 (46.5%) with accuracy unchanged at.926. Wine shows a smooth redundancy decline from.166 to.118 while accuracy stays between.746 and.748. Thus practitioners can increase α when redundancy reduction is worth a small tolerance in predictive performance.</w:t>
       </w:r>
     </w:p>
     <w:p>
@@ -334,7 +344,7 @@
     </w:p>
     <w:p>
       <w:r>
-        <w:t>Importance rank correlation rises by.179 on Wine and.017 on Pima; top-five Jaccard rises by.069 and.010, respectively. Wine's gains are significant at p=.0001. Conversely, rank stability decreases by.057 on WDBC and.040 on Sonar, with smaller negative changes on Ionosphere. Table~tab:stability shows this conditional pattern.</w:t>
+        <w:t>Importance rank correlation rises by.179 on Wine and.017 on Pima; top-five Jaccard rises by.069 and.010, respectively. Wine's gains are significant at p=.0001. Conversely, rank stability decreases by.057 on WDBC and.040 on Sonar, with smaller negative changes on Ionosphere. Table 6 shows this conditional pattern.</w:t>
       </w:r>
     </w:p>
     <w:p>
@@ -357,7 +367,7 @@
     </w:p>
     <w:p>
       <w:r>
-        <w:t>Figure~fig:trees illustrates that the WDBC root and left branch remain identical, while the right child changes from mean texture to texture error under ACP-Gini. Average node counts remain comparable because raw-gain stopping preserves informative splitting: for example, WDBC uses 24.2 nodes for ACP-Gini and 24.7 for CART.</w:t>
+        <w:t>Figure 5 illustrates that the WDBC root and left branch remain identical, while the right child changes from mean texture to texture error under ACP-Gini. Average node counts remain comparable because raw-gain stopping preserves informative splitting: for example, WDBC uses 24.2 nodes for ACP-Gini and 24.7 for CART.</w:t>
       </w:r>
     </w:p>
     <w:p>
@@ -422,6 +432,630 @@
           <w:b/>
           <w:sz w:val="18"/>
         </w:rPr>
+        <w:t>Related-work positioning.</w:t>
+      </w:r>
+    </w:p>
+    <w:tbl>
+      <w:tblPr>
+        <w:tblStyle w:val="TableGrid"/>
+        <w:tblW w:type="auto" w:w="0"/>
+        <w:tblLayout w:type="fixed"/>
+        <w:tblLook w:firstColumn="1" w:firstRow="1" w:lastColumn="0" w:lastRow="0" w:noHBand="0" w:noVBand="1" w:val="04A0"/>
+      </w:tblPr>
+      <w:tblGrid>
+        <w:gridCol w:w="1666"/>
+        <w:gridCol w:w="1666"/>
+        <w:gridCol w:w="1666"/>
+        <w:gridCol w:w="1666"/>
+        <w:gridCol w:w="1666"/>
+        <w:gridCol w:w="1666"/>
+      </w:tblGrid>
+      <w:tr>
+        <w:tc>
+          <w:tcPr>
+            <w:tcW w:type="dxa" w:w="1440"/>
+            <w:shd w:fill="E8EEF5"/>
+            <w:tcMar>
+              <w:top w:w="80" w:type="dxa"/>
+              <w:start w:w="120" w:type="dxa"/>
+              <w:bottom w:w="80" w:type="dxa"/>
+              <w:end w:w="120" w:type="dxa"/>
+            </w:tcMar>
+          </w:tcPr>
+          <w:p>
+            <w:pPr>
+              <w:spacing w:after="0"/>
+              <w:jc w:val="center"/>
+            </w:pPr>
+            <w:r>
+              <w:rPr>
+                <w:rFonts w:ascii="Times New Roman" w:hAnsi="Times New Roman"/>
+                <w:sz w:val="15"/>
+              </w:rPr>
+              <w:t>Method</w:t>
+            </w:r>
+          </w:p>
+        </w:tc>
+        <w:tc>
+          <w:tcPr>
+            <w:tcW w:type="dxa" w:w="1080"/>
+            <w:shd w:fill="E8EEF5"/>
+            <w:tcMar>
+              <w:top w:w="80" w:type="dxa"/>
+              <w:start w:w="120" w:type="dxa"/>
+              <w:bottom w:w="80" w:type="dxa"/>
+              <w:end w:w="120" w:type="dxa"/>
+            </w:tcMar>
+          </w:tcPr>
+          <w:p>
+            <w:pPr>
+              <w:spacing w:after="0"/>
+              <w:jc w:val="center"/>
+            </w:pPr>
+            <w:r>
+              <w:rPr>
+                <w:rFonts w:ascii="Times New Roman" w:hAnsi="Times New Roman"/>
+                <w:sz w:val="15"/>
+              </w:rPr>
+              <w:t>Single tree</w:t>
+            </w:r>
+          </w:p>
+        </w:tc>
+        <w:tc>
+          <w:tcPr>
+            <w:tcW w:type="dxa" w:w="1584"/>
+            <w:shd w:fill="E8EEF5"/>
+            <w:tcMar>
+              <w:top w:w="80" w:type="dxa"/>
+              <w:start w:w="120" w:type="dxa"/>
+              <w:bottom w:w="80" w:type="dxa"/>
+              <w:end w:w="120" w:type="dxa"/>
+            </w:tcMar>
+          </w:tcPr>
+          <w:p>
+            <w:pPr>
+              <w:spacing w:after="0"/>
+              <w:jc w:val="center"/>
+            </w:pPr>
+            <w:r>
+              <w:rPr>
+                <w:rFonts w:ascii="Times New Roman" w:hAnsi="Times New Roman"/>
+                <w:sz w:val="15"/>
+              </w:rPr>
+              <w:t>Correlation-aware</w:t>
+            </w:r>
+          </w:p>
+        </w:tc>
+        <w:tc>
+          <w:tcPr>
+            <w:tcW w:type="dxa" w:w="1152"/>
+            <w:shd w:fill="E8EEF5"/>
+            <w:tcMar>
+              <w:top w:w="80" w:type="dxa"/>
+              <w:start w:w="120" w:type="dxa"/>
+              <w:bottom w:w="80" w:type="dxa"/>
+              <w:end w:w="120" w:type="dxa"/>
+            </w:tcMar>
+          </w:tcPr>
+          <w:p>
+            <w:pPr>
+              <w:spacing w:after="0"/>
+              <w:jc w:val="center"/>
+            </w:pPr>
+            <w:r>
+              <w:rPr>
+                <w:rFonts w:ascii="Times New Roman" w:hAnsi="Times New Roman"/>
+                <w:sz w:val="15"/>
+              </w:rPr>
+              <w:t>Path-local</w:t>
+            </w:r>
+          </w:p>
+        </w:tc>
+        <w:tc>
+          <w:tcPr>
+            <w:tcW w:type="dxa" w:w="1584"/>
+            <w:shd w:fill="E8EEF5"/>
+            <w:tcMar>
+              <w:top w:w="80" w:type="dxa"/>
+              <w:start w:w="120" w:type="dxa"/>
+              <w:bottom w:w="80" w:type="dxa"/>
+              <w:end w:w="120" w:type="dxa"/>
+            </w:tcMar>
+          </w:tcPr>
+          <w:p>
+            <w:pPr>
+              <w:spacing w:after="0"/>
+              <w:jc w:val="center"/>
+            </w:pPr>
+            <w:r>
+              <w:rPr>
+                <w:rFonts w:ascii="Times New Roman" w:hAnsi="Times New Roman"/>
+                <w:sz w:val="15"/>
+              </w:rPr>
+              <w:t>No preprocessing</w:t>
+            </w:r>
+          </w:p>
+        </w:tc>
+        <w:tc>
+          <w:tcPr>
+            <w:tcW w:type="dxa" w:w="2088"/>
+            <w:shd w:fill="E8EEF5"/>
+            <w:tcMar>
+              <w:top w:w="80" w:type="dxa"/>
+              <w:start w:w="120" w:type="dxa"/>
+              <w:bottom w:w="80" w:type="dxa"/>
+              <w:end w:w="120" w:type="dxa"/>
+            </w:tcMar>
+          </w:tcPr>
+          <w:p>
+            <w:pPr>
+              <w:spacing w:after="0"/>
+              <w:jc w:val="center"/>
+            </w:pPr>
+            <w:r>
+              <w:rPr>
+                <w:rFonts w:ascii="Times New Roman" w:hAnsi="Times New Roman"/>
+                <w:sz w:val="15"/>
+              </w:rPr>
+              <w:t>CART-compatible at alpha=0</w:t>
+            </w:r>
+          </w:p>
+        </w:tc>
+      </w:tr>
+      <w:tr>
+        <w:tc>
+          <w:tcPr>
+            <w:tcW w:type="dxa" w:w="1440"/>
+            <w:tcMar>
+              <w:top w:w="80" w:type="dxa"/>
+              <w:start w:w="120" w:type="dxa"/>
+              <w:bottom w:w="80" w:type="dxa"/>
+              <w:end w:w="120" w:type="dxa"/>
+            </w:tcMar>
+          </w:tcPr>
+          <w:p>
+            <w:pPr>
+              <w:spacing w:after="0"/>
+              <w:jc w:val="center"/>
+            </w:pPr>
+            <w:r>
+              <w:rPr>
+                <w:rFonts w:ascii="Times New Roman" w:hAnsi="Times New Roman"/>
+                <w:sz w:val="15"/>
+              </w:rPr>
+              <w:t>VIF+CART</w:t>
+            </w:r>
+          </w:p>
+        </w:tc>
+        <w:tc>
+          <w:tcPr>
+            <w:tcW w:type="dxa" w:w="1080"/>
+            <w:tcMar>
+              <w:top w:w="80" w:type="dxa"/>
+              <w:start w:w="120" w:type="dxa"/>
+              <w:bottom w:w="80" w:type="dxa"/>
+              <w:end w:w="120" w:type="dxa"/>
+            </w:tcMar>
+          </w:tcPr>
+          <w:p>
+            <w:pPr>
+              <w:spacing w:after="0"/>
+              <w:jc w:val="center"/>
+            </w:pPr>
+            <w:r>
+              <w:rPr>
+                <w:rFonts w:ascii="Times New Roman" w:hAnsi="Times New Roman"/>
+                <w:sz w:val="15"/>
+              </w:rPr>
+              <w:t>Yes</w:t>
+            </w:r>
+          </w:p>
+        </w:tc>
+        <w:tc>
+          <w:tcPr>
+            <w:tcW w:type="dxa" w:w="1584"/>
+            <w:tcMar>
+              <w:top w:w="80" w:type="dxa"/>
+              <w:start w:w="120" w:type="dxa"/>
+              <w:bottom w:w="80" w:type="dxa"/>
+              <w:end w:w="120" w:type="dxa"/>
+            </w:tcMar>
+          </w:tcPr>
+          <w:p>
+            <w:pPr>
+              <w:spacing w:after="0"/>
+              <w:jc w:val="center"/>
+            </w:pPr>
+            <w:r>
+              <w:rPr>
+                <w:rFonts w:ascii="Times New Roman" w:hAnsi="Times New Roman"/>
+                <w:sz w:val="15"/>
+              </w:rPr>
+              <w:t>Yes</w:t>
+            </w:r>
+          </w:p>
+        </w:tc>
+        <w:tc>
+          <w:tcPr>
+            <w:tcW w:type="dxa" w:w="1152"/>
+            <w:tcMar>
+              <w:top w:w="80" w:type="dxa"/>
+              <w:start w:w="120" w:type="dxa"/>
+              <w:bottom w:w="80" w:type="dxa"/>
+              <w:end w:w="120" w:type="dxa"/>
+            </w:tcMar>
+          </w:tcPr>
+          <w:p>
+            <w:pPr>
+              <w:spacing w:after="0"/>
+              <w:jc w:val="center"/>
+            </w:pPr>
+            <w:r>
+              <w:rPr>
+                <w:rFonts w:ascii="Times New Roman" w:hAnsi="Times New Roman"/>
+                <w:sz w:val="15"/>
+              </w:rPr>
+              <w:t>No</w:t>
+            </w:r>
+          </w:p>
+        </w:tc>
+        <w:tc>
+          <w:tcPr>
+            <w:tcW w:type="dxa" w:w="1584"/>
+            <w:tcMar>
+              <w:top w:w="80" w:type="dxa"/>
+              <w:start w:w="120" w:type="dxa"/>
+              <w:bottom w:w="80" w:type="dxa"/>
+              <w:end w:w="120" w:type="dxa"/>
+            </w:tcMar>
+          </w:tcPr>
+          <w:p>
+            <w:pPr>
+              <w:spacing w:after="0"/>
+              <w:jc w:val="center"/>
+            </w:pPr>
+            <w:r>
+              <w:rPr>
+                <w:rFonts w:ascii="Times New Roman" w:hAnsi="Times New Roman"/>
+                <w:sz w:val="15"/>
+              </w:rPr>
+              <w:t>No</w:t>
+            </w:r>
+          </w:p>
+        </w:tc>
+        <w:tc>
+          <w:tcPr>
+            <w:tcW w:type="dxa" w:w="2088"/>
+            <w:tcMar>
+              <w:top w:w="80" w:type="dxa"/>
+              <w:start w:w="120" w:type="dxa"/>
+              <w:bottom w:w="80" w:type="dxa"/>
+              <w:end w:w="120" w:type="dxa"/>
+            </w:tcMar>
+          </w:tcPr>
+          <w:p>
+            <w:pPr>
+              <w:spacing w:after="0"/>
+              <w:jc w:val="center"/>
+            </w:pPr>
+            <w:r>
+              <w:rPr>
+                <w:rFonts w:ascii="Times New Roman" w:hAnsi="Times New Roman"/>
+                <w:sz w:val="15"/>
+              </w:rPr>
+              <w:t>No</w:t>
+            </w:r>
+          </w:p>
+        </w:tc>
+      </w:tr>
+      <w:tr>
+        <w:tc>
+          <w:tcPr>
+            <w:tcW w:type="dxa" w:w="1440"/>
+            <w:tcMar>
+              <w:top w:w="80" w:type="dxa"/>
+              <w:start w:w="120" w:type="dxa"/>
+              <w:bottom w:w="80" w:type="dxa"/>
+              <w:end w:w="120" w:type="dxa"/>
+            </w:tcMar>
+          </w:tcPr>
+          <w:p>
+            <w:pPr>
+              <w:spacing w:after="0"/>
+              <w:jc w:val="center"/>
+            </w:pPr>
+            <w:r>
+              <w:rPr>
+                <w:rFonts w:ascii="Times New Roman" w:hAnsi="Times New Roman"/>
+                <w:sz w:val="15"/>
+              </w:rPr>
+              <w:t>RRF-style</w:t>
+            </w:r>
+          </w:p>
+        </w:tc>
+        <w:tc>
+          <w:tcPr>
+            <w:tcW w:type="dxa" w:w="1080"/>
+            <w:tcMar>
+              <w:top w:w="80" w:type="dxa"/>
+              <w:start w:w="120" w:type="dxa"/>
+              <w:bottom w:w="80" w:type="dxa"/>
+              <w:end w:w="120" w:type="dxa"/>
+            </w:tcMar>
+          </w:tcPr>
+          <w:p>
+            <w:pPr>
+              <w:spacing w:after="0"/>
+              <w:jc w:val="center"/>
+            </w:pPr>
+            <w:r>
+              <w:rPr>
+                <w:rFonts w:ascii="Times New Roman" w:hAnsi="Times New Roman"/>
+                <w:sz w:val="15"/>
+              </w:rPr>
+              <w:t>Yes</w:t>
+            </w:r>
+          </w:p>
+        </w:tc>
+        <w:tc>
+          <w:tcPr>
+            <w:tcW w:type="dxa" w:w="1584"/>
+            <w:tcMar>
+              <w:top w:w="80" w:type="dxa"/>
+              <w:start w:w="120" w:type="dxa"/>
+              <w:bottom w:w="80" w:type="dxa"/>
+              <w:end w:w="120" w:type="dxa"/>
+            </w:tcMar>
+          </w:tcPr>
+          <w:p>
+            <w:pPr>
+              <w:spacing w:after="0"/>
+              <w:jc w:val="center"/>
+            </w:pPr>
+            <w:r>
+              <w:rPr>
+                <w:rFonts w:ascii="Times New Roman" w:hAnsi="Times New Roman"/>
+                <w:sz w:val="15"/>
+              </w:rPr>
+              <w:t>No</w:t>
+            </w:r>
+          </w:p>
+        </w:tc>
+        <w:tc>
+          <w:tcPr>
+            <w:tcW w:type="dxa" w:w="1152"/>
+            <w:tcMar>
+              <w:top w:w="80" w:type="dxa"/>
+              <w:start w:w="120" w:type="dxa"/>
+              <w:bottom w:w="80" w:type="dxa"/>
+              <w:end w:w="120" w:type="dxa"/>
+            </w:tcMar>
+          </w:tcPr>
+          <w:p>
+            <w:pPr>
+              <w:spacing w:after="0"/>
+              <w:jc w:val="center"/>
+            </w:pPr>
+            <w:r>
+              <w:rPr>
+                <w:rFonts w:ascii="Times New Roman" w:hAnsi="Times New Roman"/>
+                <w:sz w:val="15"/>
+              </w:rPr>
+              <w:t>No</w:t>
+            </w:r>
+          </w:p>
+        </w:tc>
+        <w:tc>
+          <w:tcPr>
+            <w:tcW w:type="dxa" w:w="1584"/>
+            <w:tcMar>
+              <w:top w:w="80" w:type="dxa"/>
+              <w:start w:w="120" w:type="dxa"/>
+              <w:bottom w:w="80" w:type="dxa"/>
+              <w:end w:w="120" w:type="dxa"/>
+            </w:tcMar>
+          </w:tcPr>
+          <w:p>
+            <w:pPr>
+              <w:spacing w:after="0"/>
+              <w:jc w:val="center"/>
+            </w:pPr>
+            <w:r>
+              <w:rPr>
+                <w:rFonts w:ascii="Times New Roman" w:hAnsi="Times New Roman"/>
+                <w:sz w:val="15"/>
+              </w:rPr>
+              <w:t>Yes</w:t>
+            </w:r>
+          </w:p>
+        </w:tc>
+        <w:tc>
+          <w:tcPr>
+            <w:tcW w:type="dxa" w:w="2088"/>
+            <w:tcMar>
+              <w:top w:w="80" w:type="dxa"/>
+              <w:start w:w="120" w:type="dxa"/>
+              <w:bottom w:w="80" w:type="dxa"/>
+              <w:end w:w="120" w:type="dxa"/>
+            </w:tcMar>
+          </w:tcPr>
+          <w:p>
+            <w:pPr>
+              <w:spacing w:after="0"/>
+              <w:jc w:val="center"/>
+            </w:pPr>
+            <w:r>
+              <w:rPr>
+                <w:rFonts w:ascii="Times New Roman" w:hAnsi="Times New Roman"/>
+                <w:sz w:val="15"/>
+              </w:rPr>
+              <w:t>No</w:t>
+            </w:r>
+          </w:p>
+        </w:tc>
+      </w:tr>
+      <w:tr>
+        <w:tc>
+          <w:tcPr>
+            <w:tcW w:type="dxa" w:w="1440"/>
+            <w:tcMar>
+              <w:top w:w="80" w:type="dxa"/>
+              <w:start w:w="120" w:type="dxa"/>
+              <w:bottom w:w="80" w:type="dxa"/>
+              <w:end w:w="120" w:type="dxa"/>
+            </w:tcMar>
+          </w:tcPr>
+          <w:p>
+            <w:pPr>
+              <w:spacing w:after="0"/>
+              <w:jc w:val="center"/>
+            </w:pPr>
+            <w:r>
+              <w:rPr>
+                <w:rFonts w:ascii="Times New Roman" w:hAnsi="Times New Roman"/>
+                <w:sz w:val="15"/>
+              </w:rPr>
+              <w:t>ACP-Gini</w:t>
+            </w:r>
+          </w:p>
+        </w:tc>
+        <w:tc>
+          <w:tcPr>
+            <w:tcW w:type="dxa" w:w="1080"/>
+            <w:tcMar>
+              <w:top w:w="80" w:type="dxa"/>
+              <w:start w:w="120" w:type="dxa"/>
+              <w:bottom w:w="80" w:type="dxa"/>
+              <w:end w:w="120" w:type="dxa"/>
+            </w:tcMar>
+          </w:tcPr>
+          <w:p>
+            <w:pPr>
+              <w:spacing w:after="0"/>
+              <w:jc w:val="center"/>
+            </w:pPr>
+            <w:r>
+              <w:rPr>
+                <w:rFonts w:ascii="Times New Roman" w:hAnsi="Times New Roman"/>
+                <w:sz w:val="15"/>
+              </w:rPr>
+              <w:t>Yes</w:t>
+            </w:r>
+          </w:p>
+        </w:tc>
+        <w:tc>
+          <w:tcPr>
+            <w:tcW w:type="dxa" w:w="1584"/>
+            <w:tcMar>
+              <w:top w:w="80" w:type="dxa"/>
+              <w:start w:w="120" w:type="dxa"/>
+              <w:bottom w:w="80" w:type="dxa"/>
+              <w:end w:w="120" w:type="dxa"/>
+            </w:tcMar>
+          </w:tcPr>
+          <w:p>
+            <w:pPr>
+              <w:spacing w:after="0"/>
+              <w:jc w:val="center"/>
+            </w:pPr>
+            <w:r>
+              <w:rPr>
+                <w:rFonts w:ascii="Times New Roman" w:hAnsi="Times New Roman"/>
+                <w:sz w:val="15"/>
+              </w:rPr>
+              <w:t>Yes</w:t>
+            </w:r>
+          </w:p>
+        </w:tc>
+        <w:tc>
+          <w:tcPr>
+            <w:tcW w:type="dxa" w:w="1152"/>
+            <w:tcMar>
+              <w:top w:w="80" w:type="dxa"/>
+              <w:start w:w="120" w:type="dxa"/>
+              <w:bottom w:w="80" w:type="dxa"/>
+              <w:end w:w="120" w:type="dxa"/>
+            </w:tcMar>
+          </w:tcPr>
+          <w:p>
+            <w:pPr>
+              <w:spacing w:after="0"/>
+              <w:jc w:val="center"/>
+            </w:pPr>
+            <w:r>
+              <w:rPr>
+                <w:rFonts w:ascii="Times New Roman" w:hAnsi="Times New Roman"/>
+                <w:sz w:val="15"/>
+              </w:rPr>
+              <w:t>Yes</w:t>
+            </w:r>
+          </w:p>
+        </w:tc>
+        <w:tc>
+          <w:tcPr>
+            <w:tcW w:type="dxa" w:w="1584"/>
+            <w:tcMar>
+              <w:top w:w="80" w:type="dxa"/>
+              <w:start w:w="120" w:type="dxa"/>
+              <w:bottom w:w="80" w:type="dxa"/>
+              <w:end w:w="120" w:type="dxa"/>
+            </w:tcMar>
+          </w:tcPr>
+          <w:p>
+            <w:pPr>
+              <w:spacing w:after="0"/>
+              <w:jc w:val="center"/>
+            </w:pPr>
+            <w:r>
+              <w:rPr>
+                <w:rFonts w:ascii="Times New Roman" w:hAnsi="Times New Roman"/>
+                <w:sz w:val="15"/>
+              </w:rPr>
+              <w:t>Yes</w:t>
+            </w:r>
+          </w:p>
+        </w:tc>
+        <w:tc>
+          <w:tcPr>
+            <w:tcW w:type="dxa" w:w="2088"/>
+            <w:tcMar>
+              <w:top w:w="80" w:type="dxa"/>
+              <w:start w:w="120" w:type="dxa"/>
+              <w:bottom w:w="80" w:type="dxa"/>
+              <w:end w:w="120" w:type="dxa"/>
+            </w:tcMar>
+          </w:tcPr>
+          <w:p>
+            <w:pPr>
+              <w:spacing w:after="0"/>
+              <w:jc w:val="center"/>
+            </w:pPr>
+            <w:r>
+              <w:rPr>
+                <w:rFonts w:ascii="Times New Roman" w:hAnsi="Times New Roman"/>
+                <w:sz w:val="15"/>
+              </w:rPr>
+              <w:t>Yes</w:t>
+            </w:r>
+          </w:p>
+        </w:tc>
+      </w:tr>
+    </w:tbl>
+    <w:p>
+      <w:pPr>
+        <w:spacing w:after="40"/>
+      </w:pPr>
+    </w:p>
+    <w:p>
+      <w:pPr>
+        <w:jc w:val="center"/>
+      </w:pPr>
+      <w:r>
+        <w:rPr>
+          <w:rFonts w:ascii="Times New Roman" w:hAnsi="Times New Roman"/>
+          <w:b/>
+          <w:sz w:val="18"/>
+        </w:rPr>
         <w:t>Table 1. Data-set statistics.</w:t>
       </w:r>
     </w:p>
@@ -6295,7 +6929,7 @@
                 <w:rFonts w:ascii="Times New Roman" w:hAnsi="Times New Roman"/>
                 <w:sz w:val="15"/>
               </w:rPr>
-              <w:t>0.303</w:t>
+              <w:t>0.304</w:t>
             </w:r>
           </w:p>
         </w:tc>
@@ -8193,7 +8827,7 @@
                 <w:rFonts w:ascii="Times New Roman" w:hAnsi="Times New Roman"/>
                 <w:sz w:val="15"/>
               </w:rPr>
-              <w:t>0.239</w:t>
+              <w:t>0.237</w:t>
             </w:r>
           </w:p>
         </w:tc>
@@ -8339,7 +8973,7 @@
                 <w:rFonts w:ascii="Times New Roman" w:hAnsi="Times New Roman"/>
                 <w:sz w:val="15"/>
               </w:rPr>
-              <w:t>0.266</w:t>
+              <w:t>0.267</w:t>
             </w:r>
           </w:p>
         </w:tc>

</xml_diff>